<commit_message>
Document P3 Hub and docs/p3 links in the README and paper v1.1.
Co-authored-by: Cursor <cursoragent@cursor.com>
</commit_message>
<xml_diff>
--- a/docs/papers/p3-reverse/paper_outputs/paper.docx
+++ b/docs/papers/p3-reverse/paper_outputs/paper.docx
@@ -658,7 +658,7 @@
         </w:r>
       </w:hyperlink>
       <w:r>
-        <w:t xml:space="preserve">; code</w:t>
+        <w:t xml:space="preserve">; study record</w:t>
       </w:r>
       <w:r>
         <w:t xml:space="preserve"> </w:t>
@@ -668,7 +668,7 @@
           <w:rPr>
             <w:rStyle w:val="Hyperlink"/>
           </w:rPr>
-          <w:t xml:space="preserve">https://github.com/pageman/nanochat-filipino</w:t>
+          <w:t xml:space="preserve">https://github.com/pageman/nanochat-filipino/tree/main/docs/p3</w:t>
         </w:r>
       </w:hyperlink>
       <w:r>
@@ -4829,7 +4829,7 @@
       </w:r>
     </w:p>
     <w:bookmarkEnd w:id="46"/>
-    <w:bookmarkStart w:id="47" w:name="availability"/>
+    <w:bookmarkStart w:id="48" w:name="availability"/>
     <w:p>
       <w:pPr>
         <w:pStyle w:val="Heading1"/>
@@ -4912,12 +4912,34 @@
         </w:numPr>
       </w:pPr>
       <w:r>
-        <w:t xml:space="preserve">GitHub:</w:t>
-      </w:r>
-      <w:r>
-        <w:t xml:space="preserve"> </w:t>
+        <w:t xml:space="preserve">Study record (GitHub):</w:t>
+      </w:r>
+      <w:r>
+        <w:br/>
       </w:r>
       <w:hyperlink r:id="rId12">
+        <w:r>
+          <w:rPr>
+            <w:rStyle w:val="Hyperlink"/>
+          </w:rPr>
+          <w:t xml:space="preserve">https://github.com/pageman/nanochat-filipino/tree/main/docs/p3</w:t>
+        </w:r>
+      </w:hyperlink>
+    </w:p>
+    <w:p>
+      <w:pPr>
+        <w:numPr>
+          <w:ilvl w:val="0"/>
+          <w:numId w:val="1003"/>
+        </w:numPr>
+      </w:pPr>
+      <w:r>
+        <w:t xml:space="preserve">Code and audit trees (GitHub):</w:t>
+      </w:r>
+      <w:r>
+        <w:br/>
+      </w:r>
+      <w:hyperlink r:id="rId47">
         <w:r>
           <w:rPr>
             <w:rStyle w:val="Hyperlink"/>
@@ -4929,7 +4951,7 @@
         <w:br/>
       </w:r>
       <w:r>
-        <w:t xml:space="preserve">P3-only trees:</w:t>
+        <w:t xml:space="preserve">P3-only:</w:t>
       </w:r>
       <w:r>
         <w:t xml:space="preserve"> </w:t>
@@ -4939,18 +4961,6 @@
           <w:rStyle w:val="VerbatimChar"/>
         </w:rPr>
         <w:t xml:space="preserve">scripts/p3/</w:t>
-      </w:r>
-      <w:r>
-        <w:t xml:space="preserve">,</w:t>
-      </w:r>
-      <w:r>
-        <w:t xml:space="preserve"> </w:t>
-      </w:r>
-      <w:r>
-        <w:rPr>
-          <w:rStyle w:val="VerbatimChar"/>
-        </w:rPr>
-        <w:t xml:space="preserve">docs/p3/</w:t>
       </w:r>
       <w:r>
         <w:t xml:space="preserve">,</w:t>
@@ -5009,10 +5019,10 @@
         </w:numPr>
       </w:pPr>
       <w:r>
-        <w:t xml:space="preserve">Hub:</w:t>
-      </w:r>
-      <w:r>
-        <w:t xml:space="preserve"> </w:t>
+        <w:t xml:space="preserve">Weights (Hugging Face Hub):</w:t>
+      </w:r>
+      <w:r>
+        <w:br/>
       </w:r>
       <w:hyperlink r:id="rId13">
         <w:r>
@@ -5037,8 +5047,8 @@
         <w:t xml:space="preserve">Held-out test text is not redistributed. Secrets and host credentials are not published.</w:t>
       </w:r>
     </w:p>
-    <w:bookmarkEnd w:id="47"/>
-    <w:bookmarkStart w:id="48" w:name="ethics"/>
+    <w:bookmarkEnd w:id="48"/>
+    <w:bookmarkStart w:id="49" w:name="ethics"/>
     <w:p>
       <w:pPr>
         <w:pStyle w:val="Heading1"/>
@@ -5055,8 +5065,8 @@
         <w:t xml:space="preserve">Public Wikipedia-derived corpora. No human-subjects experiment. Secrets (host credentials, box passcodes) are not published. Cheng is not a coauthor.</w:t>
       </w:r>
     </w:p>
-    <w:bookmarkEnd w:id="48"/>
-    <w:bookmarkStart w:id="49" w:name="acknowledgements"/>
+    <w:bookmarkEnd w:id="49"/>
+    <w:bookmarkStart w:id="50" w:name="acknowledgements"/>
     <w:p>
       <w:pPr>
         <w:pStyle w:val="Heading1"/>
@@ -5082,8 +5092,8 @@
         <w:t xml:space="preserve">. Errors remain the author’s.</w:t>
       </w:r>
     </w:p>
-    <w:bookmarkEnd w:id="49"/>
-    <w:bookmarkStart w:id="50" w:name="funding"/>
+    <w:bookmarkEnd w:id="50"/>
+    <w:bookmarkStart w:id="51" w:name="funding"/>
     <w:p>
       <w:pPr>
         <w:pStyle w:val="Heading1"/>
@@ -5100,8 +5110,8 @@
         <w:t xml:space="preserve">No dedicated grant. GPU time (Runpod A40) was paid by the author.</w:t>
       </w:r>
     </w:p>
-    <w:bookmarkEnd w:id="50"/>
-    <w:bookmarkStart w:id="55" w:name="app:hashes"/>
+    <w:bookmarkEnd w:id="51"/>
+    <w:bookmarkStart w:id="56" w:name="app:hashes"/>
     <w:p>
       <w:pPr>
         <w:pStyle w:val="Heading1"/>
@@ -5231,7 +5241,7 @@
       <w:r>
         <w:t xml:space="preserve"> </w:t>
       </w:r>
-      <w:hyperlink r:id="rId51">
+      <w:hyperlink r:id="rId52">
         <w:r>
           <w:rPr>
             <w:rStyle w:val="Hyperlink"/>
@@ -5291,7 +5301,7 @@
       <w:r>
         <w:t xml:space="preserve"> </w:t>
       </w:r>
-      <w:hyperlink r:id="rId52">
+      <w:hyperlink r:id="rId53">
         <w:r>
           <w:rPr>
             <w:rStyle w:val="Hyperlink"/>
@@ -5325,7 +5335,7 @@
       <w:r>
         <w:t xml:space="preserve"> </w:t>
       </w:r>
-      <w:hyperlink r:id="rId53">
+      <w:hyperlink r:id="rId54">
         <w:r>
           <w:rPr>
             <w:rStyle w:val="Hyperlink"/>
@@ -5447,7 +5457,7 @@
       <w:r>
         <w:t xml:space="preserve"> </w:t>
       </w:r>
-      <w:hyperlink r:id="rId54">
+      <w:hyperlink r:id="rId55">
         <w:r>
           <w:rPr>
             <w:rStyle w:val="Hyperlink"/>
@@ -5783,7 +5793,7 @@
         <w:t xml:space="preserve">, 7(6):632–638, 2012.</w:t>
       </w:r>
     </w:p>
-    <w:bookmarkEnd w:id="55"/>
+    <w:bookmarkEnd w:id="56"/>
     <w:sectPr>
       <w:footnotePr>
         <w:numRestart w:val="eachSect"/>

</xml_diff>